<commit_message>
Fix the press's warnings gate: checked selftest fixtures, dead code removed
Selftest fixtures wrote files without checking the result — the same
vacuous-fixture failure the proposal stores are guarded against — so the
writes now go through checked writeFixture/readFixture helpers and assert.
Removed the unused replaceOne convenience overload, two unused lambda
captures and the unused isTibetanCp helper. Build is warning-free;
102/102 suites green.

Co-Authored-By: Claude Opus 5 <noreply@anthropic.com>
</commit_message>
<xml_diff>
--- a/docs/digests/2026-09-09.draft.docx
+++ b/docs/digests/2026-09-09.draft.docx
@@ -2028,6 +2028,9 @@
   </w:docDefaults>
   <w:latentStyles w:count="276" w:defLockedState="0" w:defQFormat="0" w:defSemiHidden="0" w:defUIPriority="0" w:defUnhideWhenUsed="0"/>
   <w:style w:default="1" w:styleId="Normal" w:type="paragraph">
+    <w:pPr>
+      <w:spacing w:after="160" w:line="276" w:lineRule="auto"/>
+    </w:pPr>
     <w:name w:val="Normal"/>
     <w:qFormat/>
   </w:style>
@@ -2037,10 +2040,13 @@
     <w:link w:val="BodyTextChar"/>
     <w:qFormat/>
     <w:pPr>
-      <w:spacing w:after="180" w:before="180"/>
+      <w:spacing w:after="160" w:line="276" w:lineRule="auto"/>
     </w:pPr>
   </w:style>
   <w:style w:customStyle="1" w:styleId="FirstParagraph" w:type="paragraph">
+    <w:pPr>
+      <w:spacing w:after="160" w:line="276" w:lineRule="auto"/>
+    </w:pPr>
     <w:name w:val="First Paragraph"/>
     <w:basedOn w:val="BodyText"/>
     <w:next w:val="BodyText"/>
@@ -2051,7 +2057,7 @@
     <w:basedOn w:val="BodyText"/>
     <w:qFormat/>
     <w:pPr>
-      <w:spacing w:after="36" w:before="36"/>
+      <w:spacing w:after="80" w:line="264" w:lineRule="auto"/>
     </w:pPr>
   </w:style>
   <w:style w:styleId="Title" w:type="paragraph">
@@ -2063,14 +2069,15 @@
     <w:qFormat/>
     <w:rsid w:val="00A10FD9"/>
     <w:pPr>
-      <w:spacing w:after="80" w:line="240" w:lineRule="auto"/>
+      <w:spacing w:after="240"/>
       <w:contextualSpacing/>
       <w:jc w:val="center"/>
     </w:pPr>
     <w:rPr>
       <w:rFonts w:asciiTheme="majorHAnsi" w:cstheme="majorBidi" w:eastAsiaTheme="majorEastAsia" w:hAnsiTheme="majorHAnsi"/>
-      <w:sz w:val="56"/>
       <w:szCs w:val="56"/>
+      <w:sz w:val="22"/>
+      <w:szCs w:val="22"/>
     </w:rPr>
   </w:style>
   <w:style w:customStyle="1" w:styleId="TitleChar" w:type="character">
@@ -2196,9 +2203,10 @@
     <w:qFormat/>
     <w:rsid w:val="00A10FD9"/>
     <w:pPr>
+      <w:spacing w:after="200" w:before="480"/>
+      <w:keepNext/>
       <w:keepNext/>
       <w:keepLines/>
-      <w:spacing w:after="80" w:before="360"/>
       <w:outlineLvl w:val="0"/>
     </w:pPr>
     <w:rPr>
@@ -2219,9 +2227,10 @@
     <w:qFormat/>
     <w:rsid w:val="00A10FD9"/>
     <w:pPr>
+      <w:spacing w:after="160" w:before="420"/>
+      <w:keepNext/>
       <w:keepNext/>
       <w:keepLines/>
-      <w:spacing w:after="80" w:before="160"/>
       <w:outlineLvl w:val="1"/>
     </w:pPr>
     <w:rPr>
@@ -2242,9 +2251,10 @@
     <w:qFormat/>
     <w:rsid w:val="00A10FD9"/>
     <w:pPr>
+      <w:spacing w:after="120" w:before="320"/>
+      <w:keepNext/>
       <w:keepNext/>
       <w:keepLines/>
-      <w:spacing w:after="80" w:before="160"/>
       <w:outlineLvl w:val="2"/>
     </w:pPr>
     <w:rPr>
@@ -2588,7 +2598,7 @@
     <w:basedOn w:val="Normal"/>
     <w:link w:val="BodyTextChar"/>
     <w:pPr>
-      <w:spacing w:after="120" w:before="0"/>
+      <w:spacing w:after="320" w:before="60"/>
     </w:pPr>
     <w:rPr>
       <w:i/>
@@ -2598,14 +2608,22 @@
     <w:name w:val="Table Caption"/>
     <w:basedOn w:val="Caption"/>
     <w:pPr>
+      <w:spacing w:after="120" w:before="200"/>
       <w:keepNext/>
     </w:pPr>
   </w:style>
   <w:style w:customStyle="1" w:styleId="ImageCaption" w:type="paragraph">
+    <w:pPr>
+      <w:spacing w:after="320" w:before="60"/>
+    </w:pPr>
     <w:name w:val="Image Caption"/>
     <w:basedOn w:val="Caption"/>
   </w:style>
   <w:style w:customStyle="1" w:styleId="Figure" w:type="paragraph">
+    <w:pPr>
+      <w:spacing w:after="80" w:before="280"/>
+      <w:keepNext/>
+    </w:pPr>
     <w:name w:val="Figure"/>
     <w:basedOn w:val="Normal"/>
   </w:style>
@@ -2613,6 +2631,8 @@
     <w:name w:val="Captioned Figure"/>
     <w:basedOn w:val="Figure"/>
     <w:pPr>
+      <w:spacing w:after="80" w:before="280"/>
+      <w:keepNext/>
       <w:keepNext/>
     </w:pPr>
   </w:style>

</xml_diff>

<commit_message>
Digest readability: retune Word styles for list content, stamp image density
Two real causes behind the crowding. Pandoc styles every paragraph inside
a list as Compact, which is most of a digest, so tuning Normal alone did
nothing; Compact and the figure/caption styles now carry the house
spacing. And the 2x captures carried 96-dpi metadata, so a 544-pixel menu
was laid out 5.7 inches wide and filled a page; tools/digest_image_dpi.py
stamps 192 dpi and caps wide images to the 6.3-inch column. Values tabled
in docs/digests/README.md as a standing order.

Co-Authored-By: Claude Opus 5 <noreply@anthropic.com>
</commit_message>
<xml_diff>
--- a/docs/digests/2026-09-09.draft.docx
+++ b/docs/digests/2026-09-09.draft.docx
@@ -209,7 +209,7 @@
       <w:r>
         <w:drawing>
           <wp:inline>
-            <wp:extent cx="5181600" cy="6019800"/>
+            <wp:extent cx="2604364" cy="3025658"/>
             <wp:effectExtent b="0" l="0" r="0" t="0"/>
             <wp:docPr descr="The Insert menu: folio markers, the Tibetan and ACIP symbol palette, footnotes to the Draft, the date with the Tibetan year, and the Manuscript’s rich-text items." title="" id="10" name="Picture"/>
             <a:graphic>
@@ -230,7 +230,7 @@
                   <pic:spPr bwMode="auto">
                     <a:xfrm>
                       <a:off x="0" y="0"/>
-                      <a:ext cx="5181600" cy="6019800"/>
+                      <a:ext cx="2604364" cy="3025658"/>
                     </a:xfrm>
                     <a:prstGeom prst="rect">
                       <a:avLst/>
@@ -264,7 +264,7 @@
       <w:r>
         <w:drawing>
           <wp:inline>
-            <wp:extent cx="5334000" cy="5124507"/>
+            <wp:extent cx="3169281" cy="3044808"/>
             <wp:effectExtent b="0" l="0" r="0" t="0"/>
             <wp:docPr descr="The Tools menu: spelling doubts, phrase memory, hand-offs between panes, word count, document protection, templates, snippets and the new Compare submenu." title="" id="13" name="Picture"/>
             <a:graphic>
@@ -285,7 +285,7 @@
                   <pic:spPr bwMode="auto">
                     <a:xfrm>
                       <a:off x="0" y="0"/>
-                      <a:ext cx="5334000" cy="5124507"/>
+                      <a:ext cx="3169281" cy="3044808"/>
                     </a:xfrm>
                     <a:prstGeom prst="rect">
                       <a:avLst/>
@@ -2029,7 +2029,7 @@
   <w:latentStyles w:count="276" w:defLockedState="0" w:defQFormat="0" w:defSemiHidden="0" w:defUIPriority="0" w:defUnhideWhenUsed="0"/>
   <w:style w:default="1" w:styleId="Normal" w:type="paragraph">
     <w:pPr>
-      <w:spacing w:after="160" w:line="276" w:lineRule="auto"/>
+      <w:spacing w:after="200" w:line="288" w:lineRule="auto"/>
     </w:pPr>
     <w:name w:val="Normal"/>
     <w:qFormat/>
@@ -2040,12 +2040,12 @@
     <w:link w:val="BodyTextChar"/>
     <w:qFormat/>
     <w:pPr>
-      <w:spacing w:after="160" w:line="276" w:lineRule="auto"/>
+      <w:spacing w:after="200" w:line="288" w:lineRule="auto"/>
     </w:pPr>
   </w:style>
   <w:style w:customStyle="1" w:styleId="FirstParagraph" w:type="paragraph">
     <w:pPr>
-      <w:spacing w:after="160" w:line="276" w:lineRule="auto"/>
+      <w:spacing w:after="200" w:line="288" w:lineRule="auto"/>
     </w:pPr>
     <w:name w:val="First Paragraph"/>
     <w:basedOn w:val="BodyText"/>
@@ -2057,7 +2057,7 @@
     <w:basedOn w:val="BodyText"/>
     <w:qFormat/>
     <w:pPr>
-      <w:spacing w:after="80" w:line="264" w:lineRule="auto"/>
+      <w:spacing w:after="140" w:line="276" w:lineRule="auto"/>
     </w:pPr>
   </w:style>
   <w:style w:styleId="Title" w:type="paragraph">
@@ -2069,7 +2069,7 @@
     <w:qFormat/>
     <w:rsid w:val="00A10FD9"/>
     <w:pPr>
-      <w:spacing w:after="240"/>
+      <w:spacing w:after="320"/>
       <w:contextualSpacing/>
       <w:jc w:val="center"/>
     </w:pPr>
@@ -2203,7 +2203,7 @@
     <w:qFormat/>
     <w:rsid w:val="00A10FD9"/>
     <w:pPr>
-      <w:spacing w:after="200" w:before="480"/>
+      <w:spacing w:after="240" w:before="560"/>
       <w:keepNext/>
       <w:keepNext/>
       <w:keepLines/>
@@ -2227,7 +2227,7 @@
     <w:qFormat/>
     <w:rsid w:val="00A10FD9"/>
     <w:pPr>
-      <w:spacing w:after="160" w:before="420"/>
+      <w:spacing w:after="240" w:before="520"/>
       <w:keepNext/>
       <w:keepNext/>
       <w:keepLines/>
@@ -2251,7 +2251,7 @@
     <w:qFormat/>
     <w:rsid w:val="00A10FD9"/>
     <w:pPr>
-      <w:spacing w:after="120" w:before="320"/>
+      <w:spacing w:after="160" w:before="400"/>
       <w:keepNext/>
       <w:keepNext/>
       <w:keepLines/>
@@ -2523,7 +2523,7 @@
     <w:unhideWhenUsed/>
     <w:qFormat/>
     <w:pPr>
-      <w:spacing w:after="100" w:before="100"/>
+      <w:spacing w:after="160" w:before="160" w:line="276" w:lineRule="auto"/>
       <w:ind w:firstLine="0" w:left="480" w:right="480"/>
     </w:pPr>
   </w:style>
@@ -2598,7 +2598,7 @@
     <w:basedOn w:val="Normal"/>
     <w:link w:val="BodyTextChar"/>
     <w:pPr>
-      <w:spacing w:after="320" w:before="60"/>
+      <w:spacing w:after="480" w:before="120"/>
     </w:pPr>
     <w:rPr>
       <w:i/>
@@ -2608,20 +2608,21 @@
     <w:name w:val="Table Caption"/>
     <w:basedOn w:val="Caption"/>
     <w:pPr>
-      <w:spacing w:after="120" w:before="200"/>
+      <w:spacing w:after="140" w:before="240"/>
+      <w:keepNext/>
       <w:keepNext/>
     </w:pPr>
   </w:style>
   <w:style w:customStyle="1" w:styleId="ImageCaption" w:type="paragraph">
     <w:pPr>
-      <w:spacing w:after="320" w:before="60"/>
+      <w:spacing w:after="480" w:before="120"/>
     </w:pPr>
     <w:name w:val="Image Caption"/>
     <w:basedOn w:val="Caption"/>
   </w:style>
   <w:style w:customStyle="1" w:styleId="Figure" w:type="paragraph">
     <w:pPr>
-      <w:spacing w:after="80" w:before="280"/>
+      <w:spacing w:after="120" w:before="440"/>
       <w:keepNext/>
     </w:pPr>
     <w:name w:val="Figure"/>
@@ -2631,7 +2632,7 @@
     <w:name w:val="Captioned Figure"/>
     <w:basedOn w:val="Figure"/>
     <w:pPr>
-      <w:spacing w:after="80" w:before="280"/>
+      <w:spacing w:after="120" w:before="440"/>
       <w:keepNext/>
       <w:keepNext/>
     </w:pPr>

</xml_diff>